<commit_message>
docs(v1.7.37): full unit test report, UI screenshots, testing diagram, TH decks
- npm run test:unit:report: 2645 tests, UNIT_TEST_UI_COVERAGE.md with gate PNGs
- html-diagrams/17-testing-quality-gate (mermaid + embedded screenshots)
- Update Presentations README, TECHNICAL_DOCUMENTATION, PRESENTATION_SCRIPT
- Rebuild TECHNICAL_ARCHITECTURE Word/PPT (TH Sarabun 16pt, FC Iconic)

Co-authored-by: Cursor <cursoragent@cursor.com>
</commit_message>
<xml_diff>
--- a/docs/TECHNICAL_ARCHITECTURE_WORD_TH.docx
+++ b/docs/TECHNICAL_ARCHITECTURE_WORD_TH.docx
@@ -110,7 +110,7 @@
                 <w:b w:val="0"/>
                 <w:sz w:val="32"/>
               </w:rPr>
-              <w:t>1.7.33</w:t>
+              <w:t>1.7.37</w:t>
             </w:r>
           </w:p>
         </w:tc>
@@ -148,7 +148,7 @@
                 <w:b w:val="0"/>
                 <w:sz w:val="32"/>
               </w:rPr>
-              <w:t>27 พฤษภาคม 2569</w:t>
+              <w:t>28 พฤษภาคม 2569</w:t>
             </w:r>
           </w:p>
         </w:tc>
@@ -456,7 +456,7 @@
           <w:b w:val="0"/>
           <w:sz w:val="32"/>
         </w:rPr>
-        <w:t>เวอร์ชัน 1.7.33 | จัดทำ 27 พฤษภาคม 2569</w:t>
+        <w:t>เวอร์ชัน 1.7.37 | จัดทำ 28 พฤษภาคม 2569</w:t>
       </w:r>
     </w:p>
     <w:p>
@@ -3057,7 +3057,412 @@
           <w:b/>
           <w:sz w:val="36"/>
         </w:rPr>
-        <w:t>15. การ deploy และเอกสารอ้างอิง</w:t>
+        <w:t>15. การทดสอบและคุณภาพ (v1.7.37)</w:t>
+      </w:r>
+    </w:p>
+    <w:tbl>
+      <w:tblPr>
+        <w:tblStyle w:val="TableGrid"/>
+        <w:tblW w:type="auto" w:w="0"/>
+        <w:jc w:val="center"/>
+        <w:tblLook w:firstColumn="1" w:firstRow="1" w:lastColumn="0" w:lastRow="0" w:noHBand="0" w:noVBand="1" w:val="04A0"/>
+      </w:tblPr>
+      <w:tblGrid>
+        <w:gridCol w:w="2880"/>
+        <w:gridCol w:w="2880"/>
+        <w:gridCol w:w="2880"/>
+      </w:tblGrid>
+      <w:tr>
+        <w:tc>
+          <w:tcPr>
+            <w:tcW w:type="dxa" w:w="2880"/>
+          </w:tcPr>
+          <w:p>
+            <w:pPr>
+              <w:spacing w:after="40"/>
+            </w:pPr>
+            <w:r>
+              <w:rPr>
+                <w:rFonts w:ascii="TH Sarabun New" w:hAnsi="TH Sarabun New" w:eastAsia="TH Sarabun New"/>
+                <w:b/>
+                <w:sz w:val="32"/>
+              </w:rPr>
+              <w:t>ชั้น</w:t>
+            </w:r>
+          </w:p>
+        </w:tc>
+        <w:tc>
+          <w:tcPr>
+            <w:tcW w:type="dxa" w:w="2880"/>
+          </w:tcPr>
+          <w:p>
+            <w:pPr>
+              <w:spacing w:after="40"/>
+            </w:pPr>
+            <w:r>
+              <w:rPr>
+                <w:rFonts w:ascii="TH Sarabun New" w:hAnsi="TH Sarabun New" w:eastAsia="TH Sarabun New"/>
+                <w:b/>
+                <w:sz w:val="32"/>
+              </w:rPr>
+              <w:t>เครื่องมือ</w:t>
+            </w:r>
+          </w:p>
+        </w:tc>
+        <w:tc>
+          <w:tcPr>
+            <w:tcW w:type="dxa" w:w="2880"/>
+          </w:tcPr>
+          <w:p>
+            <w:pPr>
+              <w:spacing w:after="40"/>
+            </w:pPr>
+            <w:r>
+              <w:rPr>
+                <w:rFonts w:ascii="TH Sarabun New" w:hAnsi="TH Sarabun New" w:eastAsia="TH Sarabun New"/>
+                <w:b/>
+                <w:sz w:val="32"/>
+              </w:rPr>
+              <w:t>ผลลัพธ์</w:t>
+            </w:r>
+          </w:p>
+        </w:tc>
+      </w:tr>
+      <w:tr>
+        <w:tc>
+          <w:tcPr>
+            <w:tcW w:type="dxa" w:w="2880"/>
+          </w:tcPr>
+          <w:p>
+            <w:pPr>
+              <w:spacing w:after="40"/>
+            </w:pPr>
+            <w:r>
+              <w:rPr>
+                <w:rFonts w:ascii="TH Sarabun New" w:hAnsi="TH Sarabun New" w:eastAsia="TH Sarabun New"/>
+                <w:b w:val="0"/>
+                <w:sz w:val="32"/>
+              </w:rPr>
+              <w:t>Unit</w:t>
+            </w:r>
+          </w:p>
+        </w:tc>
+        <w:tc>
+          <w:tcPr>
+            <w:tcW w:type="dxa" w:w="2880"/>
+          </w:tcPr>
+          <w:p>
+            <w:pPr>
+              <w:spacing w:after="40"/>
+            </w:pPr>
+            <w:r>
+              <w:rPr>
+                <w:rFonts w:ascii="TH Sarabun New" w:hAnsi="TH Sarabun New" w:eastAsia="TH Sarabun New"/>
+                <w:b w:val="0"/>
+                <w:sz w:val="32"/>
+              </w:rPr>
+              <w:t>Vitest 114 ไฟล์</w:t>
+            </w:r>
+          </w:p>
+        </w:tc>
+        <w:tc>
+          <w:tcPr>
+            <w:tcW w:type="dxa" w:w="2880"/>
+          </w:tcPr>
+          <w:p>
+            <w:pPr>
+              <w:spacing w:after="40"/>
+            </w:pPr>
+            <w:r>
+              <w:rPr>
+                <w:rFonts w:ascii="TH Sarabun New" w:hAnsi="TH Sarabun New" w:eastAsia="TH Sarabun New"/>
+                <w:b w:val="0"/>
+                <w:sz w:val="32"/>
+              </w:rPr>
+              <w:t>2645 tests ผ่าน</w:t>
+            </w:r>
+          </w:p>
+        </w:tc>
+      </w:tr>
+      <w:tr>
+        <w:tc>
+          <w:tcPr>
+            <w:tcW w:type="dxa" w:w="2880"/>
+          </w:tcPr>
+          <w:p>
+            <w:pPr>
+              <w:spacing w:after="40"/>
+            </w:pPr>
+            <w:r>
+              <w:rPr>
+                <w:rFonts w:ascii="TH Sarabun New" w:hAnsi="TH Sarabun New" w:eastAsia="TH Sarabun New"/>
+                <w:b w:val="0"/>
+                <w:sz w:val="32"/>
+              </w:rPr>
+              <w:t>Sonar</w:t>
+            </w:r>
+          </w:p>
+        </w:tc>
+        <w:tc>
+          <w:tcPr>
+            <w:tcW w:type="dxa" w:w="2880"/>
+          </w:tcPr>
+          <w:p>
+            <w:pPr>
+              <w:spacing w:after="40"/>
+            </w:pPr>
+            <w:r>
+              <w:rPr>
+                <w:rFonts w:ascii="TH Sarabun New" w:hAnsi="TH Sarabun New" w:eastAsia="TH Sarabun New"/>
+                <w:b w:val="0"/>
+                <w:sz w:val="32"/>
+              </w:rPr>
+              <w:t>SonarLint + sonar:lint</w:t>
+            </w:r>
+          </w:p>
+        </w:tc>
+        <w:tc>
+          <w:tcPr>
+            <w:tcW w:type="dxa" w:w="2880"/>
+          </w:tcPr>
+          <w:p>
+            <w:pPr>
+              <w:spacing w:after="40"/>
+            </w:pPr>
+            <w:r>
+              <w:rPr>
+                <w:rFonts w:ascii="TH Sarabun New" w:hAnsi="TH Sarabun New" w:eastAsia="TH Sarabun New"/>
+                <w:b w:val="0"/>
+                <w:sz w:val="32"/>
+              </w:rPr>
+              <w:t>server/ รวมใน Sonar sources</w:t>
+            </w:r>
+          </w:p>
+        </w:tc>
+      </w:tr>
+      <w:tr>
+        <w:tc>
+          <w:tcPr>
+            <w:tcW w:type="dxa" w:w="2880"/>
+          </w:tcPr>
+          <w:p>
+            <w:pPr>
+              <w:spacing w:after="40"/>
+            </w:pPr>
+            <w:r>
+              <w:rPr>
+                <w:rFonts w:ascii="TH Sarabun New" w:hAnsi="TH Sarabun New" w:eastAsia="TH Sarabun New"/>
+                <w:b w:val="0"/>
+                <w:sz w:val="32"/>
+              </w:rPr>
+              <w:t>Cloud API</w:t>
+            </w:r>
+          </w:p>
+        </w:tc>
+        <w:tc>
+          <w:tcPr>
+            <w:tcW w:type="dxa" w:w="2880"/>
+          </w:tcPr>
+          <w:p>
+            <w:pPr>
+              <w:spacing w:after="40"/>
+            </w:pPr>
+            <w:r>
+              <w:rPr>
+                <w:rFonts w:ascii="TH Sarabun New" w:hAnsi="TH Sarabun New" w:eastAsia="TH Sarabun New"/>
+                <w:b w:val="0"/>
+                <w:sz w:val="32"/>
+              </w:rPr>
+              <w:t>verify:gate0</w:t>
+            </w:r>
+          </w:p>
+        </w:tc>
+        <w:tc>
+          <w:tcPr>
+            <w:tcW w:type="dxa" w:w="2880"/>
+          </w:tcPr>
+          <w:p>
+            <w:pPr>
+              <w:spacing w:after="40"/>
+            </w:pPr>
+            <w:r>
+              <w:rPr>
+                <w:rFonts w:ascii="TH Sarabun New" w:hAnsi="TH Sarabun New" w:eastAsia="TH Sarabun New"/>
+                <w:b w:val="0"/>
+                <w:sz w:val="32"/>
+              </w:rPr>
+              <w:t>G1–G5 นัดหมาย</w:t>
+            </w:r>
+          </w:p>
+        </w:tc>
+      </w:tr>
+      <w:tr>
+        <w:tc>
+          <w:tcPr>
+            <w:tcW w:type="dxa" w:w="2880"/>
+          </w:tcPr>
+          <w:p>
+            <w:pPr>
+              <w:spacing w:after="40"/>
+            </w:pPr>
+            <w:r>
+              <w:rPr>
+                <w:rFonts w:ascii="TH Sarabun New" w:hAnsi="TH Sarabun New" w:eastAsia="TH Sarabun New"/>
+                <w:b w:val="0"/>
+                <w:sz w:val="32"/>
+              </w:rPr>
+              <w:t>Cloud UI</w:t>
+            </w:r>
+          </w:p>
+        </w:tc>
+        <w:tc>
+          <w:tcPr>
+            <w:tcW w:type="dxa" w:w="2880"/>
+          </w:tcPr>
+          <w:p>
+            <w:pPr>
+              <w:spacing w:after="40"/>
+            </w:pPr>
+            <w:r>
+              <w:rPr>
+                <w:rFonts w:ascii="TH Sarabun New" w:hAnsi="TH Sarabun New" w:eastAsia="TH Sarabun New"/>
+                <w:b w:val="0"/>
+                <w:sz w:val="32"/>
+              </w:rPr>
+              <w:t>Playwright A + 7 viewports</w:t>
+            </w:r>
+          </w:p>
+        </w:tc>
+        <w:tc>
+          <w:tcPr>
+            <w:tcW w:type="dxa" w:w="2880"/>
+          </w:tcPr>
+          <w:p>
+            <w:pPr>
+              <w:spacing w:after="40"/>
+            </w:pPr>
+            <w:r>
+              <w:rPr>
+                <w:rFonts w:ascii="TH Sarabun New" w:hAnsi="TH Sarabun New" w:eastAsia="TH Sarabun New"/>
+                <w:b w:val="0"/>
+                <w:sz w:val="32"/>
+              </w:rPr>
+              <w:t>41 tests + screenshots</w:t>
+            </w:r>
+          </w:p>
+        </w:tc>
+      </w:tr>
+      <w:tr>
+        <w:tc>
+          <w:tcPr>
+            <w:tcW w:type="dxa" w:w="2880"/>
+          </w:tcPr>
+          <w:p>
+            <w:pPr>
+              <w:spacing w:after="40"/>
+            </w:pPr>
+            <w:r>
+              <w:rPr>
+                <w:rFonts w:ascii="TH Sarabun New" w:hAnsi="TH Sarabun New" w:eastAsia="TH Sarabun New"/>
+                <w:b w:val="0"/>
+                <w:sz w:val="32"/>
+              </w:rPr>
+              <w:t>เอกสาร</w:t>
+            </w:r>
+          </w:p>
+        </w:tc>
+        <w:tc>
+          <w:tcPr>
+            <w:tcW w:type="dxa" w:w="2880"/>
+          </w:tcPr>
+          <w:p>
+            <w:pPr>
+              <w:spacing w:after="40"/>
+            </w:pPr>
+            <w:r>
+              <w:rPr>
+                <w:rFonts w:ascii="TH Sarabun New" w:hAnsi="TH Sarabun New" w:eastAsia="TH Sarabun New"/>
+                <w:b w:val="0"/>
+                <w:sz w:val="32"/>
+              </w:rPr>
+              <w:t>UNIT_TEST_UI_COVERAGE.md</w:t>
+            </w:r>
+          </w:p>
+        </w:tc>
+        <w:tc>
+          <w:tcPr>
+            <w:tcW w:type="dxa" w:w="2880"/>
+          </w:tcPr>
+          <w:p>
+            <w:pPr>
+              <w:spacing w:after="40"/>
+            </w:pPr>
+            <w:r>
+              <w:rPr>
+                <w:rFonts w:ascii="TH Sarabun New" w:hAnsi="TH Sarabun New" w:eastAsia="TH Sarabun New"/>
+                <w:b w:val="0"/>
+                <w:sz w:val="32"/>
+              </w:rPr>
+              <w:t>แมป unit → ภาพ UI</w:t>
+            </w:r>
+          </w:p>
+        </w:tc>
+      </w:tr>
+    </w:tbl>
+    <w:p/>
+    <w:p>
+      <w:pPr>
+        <w:pStyle w:val="ListBullet"/>
+        <w:spacing w:lineRule="auto" w:line="276"/>
+      </w:pPr>
+      <w:r>
+        <w:rPr>
+          <w:rFonts w:ascii="TH Sarabun New" w:hAnsi="TH Sarabun New" w:eastAsia="TH Sarabun New"/>
+          <w:b w:val="0"/>
+          <w:sz w:val="32"/>
+        </w:rPr>
+        <w:t>แผนภาพ: Presentations/html-diagrams/17-testing-quality-gate.html</w:t>
+      </w:r>
+    </w:p>
+    <w:p>
+      <w:pPr>
+        <w:pStyle w:val="ListBullet"/>
+        <w:spacing w:lineRule="auto" w:line="276"/>
+      </w:pPr>
+      <w:r>
+        <w:rPr>
+          <w:rFonts w:ascii="TH Sarabun New" w:hAnsi="TH Sarabun New" w:eastAsia="TH Sarabun New"/>
+          <w:b w:val="0"/>
+          <w:sz w:val="32"/>
+        </w:rPr>
+        <w:t>ภาพหน้าจอ: docs/screenshots/group-A, group-S, workflows/*</w:t>
+      </w:r>
+    </w:p>
+    <w:p>
+      <w:pPr>
+        <w:spacing w:lineRule="auto" w:line="276" w:after="120"/>
+      </w:pPr>
+      <w:r>
+        <w:rPr>
+          <w:rFonts w:ascii="TH Sarabun New" w:hAnsi="TH Sarabun New" w:eastAsia="TH Sarabun New"/>
+          <w:b w:val="0"/>
+          <w:sz w:val="32"/>
+        </w:rPr>
+        <w:t>บันทึกวิทยากร: npm run test:unit:report และ test:gate:ui-showup</w:t>
+      </w:r>
+    </w:p>
+    <w:p>
+      <w:pPr>
+        <w:pStyle w:val="Heading1"/>
+        <w:spacing w:lineRule="auto" w:line="276"/>
+      </w:pPr>
+      <w:r>
+        <w:rPr>
+          <w:rFonts w:ascii="TH Sarabun New" w:hAnsi="TH Sarabun New" w:eastAsia="TH Sarabun New"/>
+          <w:b/>
+          <w:sz w:val="36"/>
+        </w:rPr>
+        <w:t>16. การ deploy และเอกสารอ้างอิง</w:t>
       </w:r>
     </w:p>
     <w:p>
@@ -3085,7 +3490,7 @@
           <w:b w:val="0"/>
           <w:sz w:val="32"/>
         </w:rPr>
-        <w:t>Cloud: Isara-doctor-portal/cloudbuild.yaml หรือ scripts/deploy/cloud.ps1</w:t>
+        <w:t>Cloud: npm run cloud:deploy -- -Tag v1.7.37 + traffic shift</w:t>
       </w:r>
     </w:p>
     <w:p>
@@ -3127,7 +3532,7 @@
           <w:b w:val="0"/>
           <w:sz w:val="32"/>
         </w:rPr>
-        <w:t>สร้างคู่มือ: python scripts/build-technical-architecture-docs.py</w:t>
+        <w:t>สร้างคู่มือ: npm run guides:technical (TH Sarabun 16pt, FC Iconic PPT)</w:t>
       </w:r>
     </w:p>
     <w:p>

</xml_diff>

<commit_message>
release(v1.7.37): verify quality gates, deploy revs 00138/00113
Align patient/jitsi health to 1.7.37, JitsiMeetingShell safe-area, gate artifacts and cloud traffic docs after full test:quality:gate and UI gates.

Co-authored-by: Cursor <cursoragent@cursor.com>
</commit_message>
<xml_diff>
--- a/docs/TECHNICAL_ARCHITECTURE_WORD_TH.docx
+++ b/docs/TECHNICAL_ARCHITECTURE_WORD_TH.docx
@@ -3179,7 +3179,7 @@
                 <w:b w:val="0"/>
                 <w:sz w:val="32"/>
               </w:rPr>
-              <w:t>2645 tests ผ่าน</w:t>
+              <w:t>2646 tests ผ่าน</w:t>
             </w:r>
           </w:p>
         </w:tc>
@@ -3440,6 +3440,20 @@
     </w:p>
     <w:p>
       <w:pPr>
+        <w:pStyle w:val="ListBullet"/>
+        <w:spacing w:lineRule="auto" w:line="276"/>
+      </w:pPr>
+      <w:r>
+        <w:rPr>
+          <w:rFonts w:ascii="TH Sarabun New" w:hAnsi="TH Sarabun New" w:eastAsia="TH Sarabun New"/>
+          <w:b w:val="0"/>
+          <w:sz w:val="32"/>
+        </w:rPr>
+        <w:t>Patient Cloud Run: revision 00112-mrm — PHR timeline PATIENT-DEMO 200 (ไม่มี 500 ใน S03)</w:t>
+      </w:r>
+    </w:p>
+    <w:p>
+      <w:pPr>
         <w:spacing w:lineRule="auto" w:line="276" w:after="120"/>
       </w:pPr>
       <w:r>
@@ -3448,7 +3462,7 @@
           <w:b w:val="0"/>
           <w:sz w:val="32"/>
         </w:rPr>
-        <w:t>บันทึกวิทยากร: npm run test:unit:report และ test:gate:ui-showup</w:t>
+        <w:t>บันทึกวิทยากร: npm run test:unit:report และ test:gate:ui-showup; หลัง deploy ต้อง shift traffic</w:t>
       </w:r>
     </w:p>
     <w:p>
@@ -3490,7 +3504,7 @@
           <w:b w:val="0"/>
           <w:sz w:val="32"/>
         </w:rPr>
-        <w:t>Cloud: npm run cloud:deploy -- -Tag v1.7.37 + traffic shift</w:t>
+        <w:t>Cloud: npm run cloud:deploy -- -Tag v1.7.37 + gcloud update-traffic (patient 00112-mrm)</w:t>
       </w:r>
     </w:p>
     <w:p>

</xml_diff>

<commit_message>
release(v1.7.48): defect PDF re-audit, Sonar clinical extract, cloud 85/85 headed
All 23 defects verified; 2736 unit tests, 36 defect-regression and 85 full cloud Playwright PASS. Clinical component extraction (EmrEditorChrome, PrescribingModalChrome, LiveTranscriptionView), user guides and screenshots refreshed.

Co-authored-by: Cursor <cursoragent@cursor.com>
</commit_message>
<xml_diff>
--- a/docs/TECHNICAL_ARCHITECTURE_WORD_TH.docx
+++ b/docs/TECHNICAL_ARCHITECTURE_WORD_TH.docx
@@ -110,7 +110,7 @@
                 <w:b w:val="0"/>
                 <w:sz w:val="32"/>
               </w:rPr>
-              <w:t>1.7.37</w:t>
+              <w:t>1.7.45</w:t>
             </w:r>
           </w:p>
         </w:tc>
@@ -148,7 +148,7 @@
                 <w:b w:val="0"/>
                 <w:sz w:val="32"/>
               </w:rPr>
-              <w:t>28 พฤษภาคม 2569</w:t>
+              <w:t>30 พฤษภาคม 2569</w:t>
             </w:r>
           </w:p>
         </w:tc>
@@ -456,7 +456,7 @@
           <w:b w:val="0"/>
           <w:sz w:val="32"/>
         </w:rPr>
-        <w:t>เวอร์ชัน 1.7.37 | จัดทำ 28 พฤษภาคม 2569</w:t>
+        <w:t>เวอร์ชัน 1.7.45 | จัดทำ 30 พฤษภาคม 2569</w:t>
       </w:r>
     </w:p>
     <w:p>
@@ -3057,7 +3057,7 @@
           <w:b/>
           <w:sz w:val="36"/>
         </w:rPr>
-        <w:t>15. การทดสอบและคุณภาพ (v1.7.37)</w:t>
+        <w:t>15. การทดสอบและคุณภาพ (v1.7.45)</w:t>
       </w:r>
     </w:p>
     <w:tbl>
@@ -3161,7 +3161,7 @@
                 <w:b w:val="0"/>
                 <w:sz w:val="32"/>
               </w:rPr>
-              <w:t>Vitest 114 ไฟล์</w:t>
+              <w:t>Vitest 150 ไฟล์</w:t>
             </w:r>
           </w:p>
         </w:tc>
@@ -3179,7 +3179,7 @@
                 <w:b w:val="0"/>
                 <w:sz w:val="32"/>
               </w:rPr>
-              <w:t>2646 tests ผ่าน</w:t>
+              <w:t>2731 tests ผ่าน</w:t>
             </w:r>
           </w:p>
         </w:tc>
@@ -3217,7 +3217,7 @@
                 <w:b w:val="0"/>
                 <w:sz w:val="32"/>
               </w:rPr>
-              <w:t>SonarLint + sonar:lint</w:t>
+              <w:t>SonarLint + sonar-project.properties</w:t>
             </w:r>
           </w:p>
         </w:tc>
@@ -3235,7 +3235,7 @@
                 <w:b w:val="0"/>
                 <w:sz w:val="32"/>
               </w:rPr>
-              <w:t>server/ รวมใน Sonar sources</w:t>
+              <w:t>S1874/S6594 แก้แล้ว; S6747 suppress</w:t>
             </w:r>
           </w:p>
         </w:tc>
@@ -3273,7 +3273,7 @@
                 <w:b w:val="0"/>
                 <w:sz w:val="32"/>
               </w:rPr>
-              <w:t>verify:gate0</w:t>
+              <w:t>test:cloud:unit-gate + GATE0</w:t>
             </w:r>
           </w:p>
         </w:tc>
@@ -3291,7 +3291,7 @@
                 <w:b w:val="0"/>
                 <w:sz w:val="32"/>
               </w:rPr>
-              <w:t>G1–G5 นัดหมาย</w:t>
+              <w:t>78 cloud unit + G1–G5</w:t>
             </w:r>
           </w:p>
         </w:tc>
@@ -3311,7 +3311,7 @@
                 <w:b w:val="0"/>
                 <w:sz w:val="32"/>
               </w:rPr>
-              <w:t>Cloud UI</w:t>
+              <w:t>Defect UI</w:t>
             </w:r>
           </w:p>
         </w:tc>
@@ -3329,7 +3329,7 @@
                 <w:b w:val="0"/>
                 <w:sz w:val="32"/>
               </w:rPr>
-              <w:t>Playwright A + 7 viewports</w:t>
+              <w:t>Playwright Defect-regression</w:t>
             </w:r>
           </w:p>
         </w:tc>
@@ -3347,7 +3347,7 @@
                 <w:b w:val="0"/>
                 <w:sz w:val="32"/>
               </w:rPr>
-              <w:t>41 tests + screenshots</w:t>
+              <w:t>34 passed, 2 skipped (cloud)</w:t>
             </w:r>
           </w:p>
         </w:tc>
@@ -3385,7 +3385,7 @@
                 <w:b w:val="0"/>
                 <w:sz w:val="32"/>
               </w:rPr>
-              <w:t>UNIT_TEST_UI_COVERAGE.md</w:t>
+              <w:t>draw.io + DOCX/PPTX/PDF</w:t>
             </w:r>
           </w:p>
         </w:tc>
@@ -3403,7 +3403,7 @@
                 <w:b w:val="0"/>
                 <w:sz w:val="32"/>
               </w:rPr>
-              <w:t>แมป unit → ภาพ UI</w:t>
+              <w:t>docs/diagrams.drawio — ไม่ใช้ HTML diagram</w:t>
             </w:r>
           </w:p>
         </w:tc>
@@ -3421,7 +3421,7 @@
           <w:b w:val="0"/>
           <w:sz w:val="32"/>
         </w:rPr>
-        <w:t>แผนภาพ: Presentations/html-diagrams/17-testing-quality-gate.html</w:t>
+        <w:t>แผนภาพ: docs/diagrams.drawio (export PNG/PDF จาก draw.io)</w:t>
       </w:r>
     </w:p>
     <w:p>
@@ -3435,7 +3435,7 @@
           <w:b w:val="0"/>
           <w:sz w:val="32"/>
         </w:rPr>
-        <w:t>ภาพหน้าจอ: docs/screenshots/group-A, group-S, workflows/*</w:t>
+        <w:t>Defect pack: DN5, DP1, DJ1–DJ2 + v1.7.44 suites</w:t>
       </w:r>
     </w:p>
     <w:p>
@@ -3449,7 +3449,7 @@
           <w:b w:val="0"/>
           <w:sz w:val="32"/>
         </w:rPr>
-        <w:t>Patient Cloud Run: revision 00112-mrm — PHR timeline PATIENT-DEMO 200 (ไม่มี 500 ใน S03)</w:t>
+        <w:t>PHR persist, map lang=, health library thumbnail</w:t>
       </w:r>
     </w:p>
     <w:p>
@@ -3462,7 +3462,7 @@
           <w:b w:val="0"/>
           <w:sz w:val="32"/>
         </w:rPr>
-        <w:t>บันทึกวิทยากร: npm run test:unit:report และ test:gate:ui-showup; หลัง deploy ต้อง shift traffic</w:t>
+        <w:t>บันทึกวิทยากร: npm run test:unit; test:quality:gate; test:cloud:unit-gate</w:t>
       </w:r>
     </w:p>
     <w:p>
@@ -3476,7 +3476,90 @@
           <w:b/>
           <w:sz w:val="36"/>
         </w:rPr>
-        <w:t>16. การ deploy และเอกสารอ้างอิง</w:t>
+        <w:t>16. Defect Remediation v1.7.45</w:t>
+      </w:r>
+    </w:p>
+    <w:p>
+      <w:pPr>
+        <w:pStyle w:val="ListBullet"/>
+        <w:spacing w:lineRule="auto" w:line="276"/>
+      </w:pPr>
+      <w:r>
+        <w:rPr>
+          <w:rFonts w:ascii="TH Sarabun New" w:hAnsi="TH Sarabun New" w:eastAsia="TH Sarabun New"/>
+          <w:b w:val="0"/>
+          <w:sz w:val="32"/>
+        </w:rPr>
+        <w:t>23/23 defects Verified — PDF Defect หมออิสระ</w:t>
+      </w:r>
+    </w:p>
+    <w:p>
+      <w:pPr>
+        <w:pStyle w:val="ListBullet"/>
+        <w:spacing w:lineRule="auto" w:line="276"/>
+      </w:pPr>
+      <w:r>
+        <w:rPr>
+          <w:rFonts w:ascii="TH Sarabun New" w:hAnsi="TH Sarabun New" w:eastAsia="TH Sarabun New"/>
+          <w:b w:val="0"/>
+          <w:sz w:val="32"/>
+        </w:rPr>
+        <w:t>Sonar: emrService Blob URL print (S1874); scheduleCountParity RegExp.exec (S6594)</w:t>
+      </w:r>
+    </w:p>
+    <w:p>
+      <w:pPr>
+        <w:pStyle w:val="ListBullet"/>
+        <w:spacing w:lineRule="auto" w:line="276"/>
+      </w:pPr>
+      <w:r>
+        <w:rPr>
+          <w:rFonts w:ascii="TH Sarabun New" w:hAnsi="TH Sarabun New" w:eastAsia="TH Sarabun New"/>
+          <w:b w:val="0"/>
+          <w:sz w:val="32"/>
+        </w:rPr>
+        <w:t>S6747/S6438: CompleteEMREditor, CompletePrescribing, LiveTranscription — parser false positive</w:t>
+      </w:r>
+    </w:p>
+    <w:p>
+      <w:pPr>
+        <w:pStyle w:val="ListBullet"/>
+        <w:spacing w:lineRule="auto" w:line="276"/>
+      </w:pPr>
+      <w:r>
+        <w:rPr>
+          <w:rFonts w:ascii="TH Sarabun New" w:hAnsi="TH Sarabun New" w:eastAsia="TH Sarabun New"/>
+          <w:b w:val="0"/>
+          <w:sz w:val="32"/>
+        </w:rPr>
+        <w:t>Playwright: DN5 mark-all UI, DP1 PHR re-login, DJ1 map lang, DJ2 thumbnail</w:t>
+      </w:r>
+    </w:p>
+    <w:p>
+      <w:pPr>
+        <w:spacing w:lineRule="auto" w:line="276" w:after="120"/>
+      </w:pPr>
+      <w:r>
+        <w:rPr>
+          <w:rFonts w:ascii="TH Sarabun New" w:hAnsi="TH Sarabun New" w:eastAsia="TH Sarabun New"/>
+          <w:b w:val="0"/>
+          <w:sz w:val="32"/>
+        </w:rPr>
+        <w:t>บันทึกวิทยากร: reports/defect-fix/v1.7.45-final.txt; DEFECT_REMEDIATION_DRAWIO_UPDATES §9</w:t>
+      </w:r>
+    </w:p>
+    <w:p>
+      <w:pPr>
+        <w:pStyle w:val="Heading1"/>
+        <w:spacing w:lineRule="auto" w:line="276"/>
+      </w:pPr>
+      <w:r>
+        <w:rPr>
+          <w:rFonts w:ascii="TH Sarabun New" w:hAnsi="TH Sarabun New" w:eastAsia="TH Sarabun New"/>
+          <w:b/>
+          <w:sz w:val="36"/>
+        </w:rPr>
+        <w:t>17. การ deploy และเอกสารอ้างอิง</w:t>
       </w:r>
     </w:p>
     <w:p>
@@ -3504,7 +3587,7 @@
           <w:b w:val="0"/>
           <w:sz w:val="32"/>
         </w:rPr>
-        <w:t>Cloud: npm run cloud:deploy -- -Tag v1.7.37 + gcloud update-traffic (patient 00112-mrm)</w:t>
+        <w:t>Cloud: npm run cloud:deploy -- -Tag v1.7.45 + gcloud update-traffic</w:t>
       </w:r>
     </w:p>
     <w:p>

</xml_diff>